<commit_message>
added contract download as pdf + major refactoring
</commit_message>
<xml_diff>
--- a/contracts/src/test/resources/doc_file.docx
+++ b/contracts/src/test/resources/doc_file.docx
@@ -14,6 +14,18 @@
     <w:p>
       <w:r>
         <w:t>Client Name: ......</w:t>
+      </w:r>
+      <w:r>
+        <w:t>...........................................................</w:t>
+      </w:r>
+      <w:r>
+        <w:t>.................................................................</w:t>
+      </w:r>
+      <w:r>
+        <w:t xml:space="preserve"> </w:t>
+      </w:r>
+      <w:r>
+        <w:t>.................................................................</w:t>
       </w:r>
     </w:p>
     <w:p>

</xml_diff>